<commit_message>
feat: improve readability and simplify study workflows
</commit_message>
<xml_diff>
--- a/docs/使用说明书.docx
+++ b/docs/使用说明书.docx
@@ -1024,7 +1024,7 @@
     </w:p>
     <w:p>
       <w:r>
-        <w:t>3. 点击“测试连接”。这个按钮会先保存当前表单，然后发起一次很短的测试请求。</w:t>
+        <w:t>3. 点击“保存并测试连接”。这个按钮一次完成保存和测试；只想保存而不发送请求时，选择“仅保存设置”。密钥旁的“显示/隐藏”可帮助检查粘贴内容，检查后请隐藏。</w:t>
       </w:r>
     </w:p>
     <w:p>
@@ -1314,6 +1314,11 @@
     <w:p/>
     <w:p>
       <w:r>
+        <w:t>上传成功后，可以直接点击“生成知识清单”或“准备实验报告”等下一步按钮。填写过的主题、报告标题等会在本次打开页面期间保留；刷新或关闭页面后需要重新填写。API 密钥不会作为表单草稿保存。</w:t>
+      </w:r>
+    </w:p>
+    <w:p>
+      <w:r>
         <w:drawing>
           <wp:inline xmlns:a="http://schemas.openxmlformats.org/drawingml/2006/main" xmlns:pic="http://schemas.openxmlformats.org/drawingml/2006/picture">
             <wp:extent cx="5989320" cy="3992880"/>
@@ -1559,7 +1564,7 @@
     </w:p>
     <w:p>
       <w:r>
-        <w:t>2. 展开“学习依据”，勾选本次需要的课程或实验材料。报告模板不能单独提供知识来源。</w:t>
+        <w:t>2. 学习材料默认已选中；需要调整时展开“学习依据”，可以全选、清空或逐个勾选。实验报告页还可一键只选实验材料。报告模板不能单独提供知识来源。</w:t>
       </w:r>
     </w:p>
     <w:p>
@@ -1785,7 +1790,7 @@
     </w:p>
     <w:p>
       <w:r>
-        <w:t>右侧英文开放教材入口是补充阅读，不等于教师指定教材。若术语或教学范围不同，以本课程要求为准。</w:t>
+        <w:t>页面下方“需要帮助？查看使用提示”中提供英文开放教材入口，属于补充阅读，不等于教师指定教材。若术语或教学范围不同，以本课程要求为准。</w:t>
       </w:r>
     </w:p>
     <w:p>
@@ -2518,6 +2523,11 @@
     </w:p>
     <w:p>
       <w:r>
+        <w:t>字体看不清时，点击右上角“大字”切换为大字模式，再点“标准字”恢复。选择会保存在当前浏览器。常见操作完成后，小猫只改变状态，不会反复弹出提示遮挡内容；需要时点击它即可。</w:t>
+      </w:r>
+    </w:p>
+    <w:p>
+      <w:r>
         <w:t>给自己一个可执行的节奏：课后整理一小章 → 解释一个机制 → 做 5 道题 → 第二天花 10 分钟回忆。每次范围小一点，比一次生成大量内容更容易真正用起来。</w:t>
       </w:r>
     </w:p>
@@ -3223,7 +3233,7 @@
               <w:rPr>
                 <w:sz w:val="18"/>
               </w:rPr>
-              <w:t>02 / 小猫会陪你学习</w:t>
+              <w:t>02 / 小猫陪伴与大字模式</w:t>
             </w:r>
           </w:p>
         </w:tc>
@@ -3236,7 +3246,7 @@
               <w:rPr>
                 <w:sz w:val="18"/>
               </w:rPr>
-              <w:t>点击小猫可以摸摸它；提示可收起，动画也可以暂停。摸猫不会调用 API。</w:t>
+              <w:t>右上角“大字”可放大文字；小猫可以摸摸，也能暂停动画。它不会反复弹出提示遮挡内容。</w:t>
             </w:r>
           </w:p>
         </w:tc>
@@ -3251,7 +3261,7 @@
               <w:rPr>
                 <w:sz w:val="18"/>
               </w:rPr>
-              <w:t>00:21</w:t>
+              <w:t>00:26</w:t>
             </w:r>
           </w:p>
         </w:tc>
@@ -3292,7 +3302,7 @@
               <w:rPr>
                 <w:sz w:val="18"/>
               </w:rPr>
-              <w:t>00:35</w:t>
+              <w:t>00:40</w:t>
             </w:r>
           </w:p>
         </w:tc>
@@ -3333,7 +3343,7 @@
               <w:rPr>
                 <w:sz w:val="18"/>
               </w:rPr>
-              <w:t>00:54</w:t>
+              <w:t>00:59</w:t>
             </w:r>
           </w:p>
         </w:tc>
@@ -3374,7 +3384,7 @@
               <w:rPr>
                 <w:sz w:val="18"/>
               </w:rPr>
-              <w:t>01:15</w:t>
+              <w:t>01:20</w:t>
             </w:r>
           </w:p>
         </w:tc>
@@ -3415,7 +3425,7 @@
               <w:rPr>
                 <w:sz w:val="18"/>
               </w:rPr>
-              <w:t>01:27</w:t>
+              <w:t>01:32</w:t>
             </w:r>
           </w:p>
         </w:tc>
@@ -3456,7 +3466,7 @@
               <w:rPr>
                 <w:sz w:val="18"/>
               </w:rPr>
-              <w:t>01:40</w:t>
+              <w:t>01:45</w:t>
             </w:r>
           </w:p>
         </w:tc>
@@ -3497,7 +3507,7 @@
               <w:rPr>
                 <w:sz w:val="18"/>
               </w:rPr>
-              <w:t>01:57</w:t>
+              <w:t>02:01</w:t>
             </w:r>
           </w:p>
         </w:tc>
@@ -3538,7 +3548,7 @@
               <w:rPr>
                 <w:sz w:val="18"/>
               </w:rPr>
-              <w:t>02:11</w:t>
+              <w:t>02:16</w:t>
             </w:r>
           </w:p>
         </w:tc>
@@ -3579,7 +3589,7 @@
               <w:rPr>
                 <w:sz w:val="18"/>
               </w:rPr>
-              <w:t>02:27</w:t>
+              <w:t>02:31</w:t>
             </w:r>
           </w:p>
         </w:tc>
@@ -3620,7 +3630,7 @@
               <w:rPr>
                 <w:sz w:val="18"/>
               </w:rPr>
-              <w:t>02:39</w:t>
+              <w:t>02:44</w:t>
             </w:r>
           </w:p>
         </w:tc>
@@ -3661,7 +3671,7 @@
               <w:rPr>
                 <w:sz w:val="18"/>
               </w:rPr>
-              <w:t>02:50</w:t>
+              <w:t>02:55</w:t>
             </w:r>
           </w:p>
         </w:tc>
@@ -3702,7 +3712,7 @@
               <w:rPr>
                 <w:sz w:val="18"/>
               </w:rPr>
-              <w:t>03:04</w:t>
+              <w:t>03:08</w:t>
             </w:r>
           </w:p>
         </w:tc>
@@ -3743,7 +3753,7 @@
               <w:rPr>
                 <w:sz w:val="18"/>
               </w:rPr>
-              <w:t>03:13</w:t>
+              <w:t>03:17</w:t>
             </w:r>
           </w:p>
         </w:tc>

</xml_diff>

<commit_message>
fix: distinguish API connectivity from truncated generation
</commit_message>
<xml_diff>
--- a/docs/使用说明书.docx
+++ b/docs/使用说明书.docx
@@ -1029,7 +1029,7 @@
     </w:p>
     <w:p>
       <w:r>
-        <w:t>4. 看到“API 请求成功；可以开始学习”再继续。若出现错误，按第 15 节排查。</w:t>
+        <w:t>4. 看到“API 请求成功；可以开始学习”再继续。若提示“API 连接成功，模型已响应；短测试达到输出上限”，表示连接可用，但尚未验证完整生成，可先用少量材料试生成。若出现错误，按第 15 节排查。</w:t>
       </w:r>
     </w:p>
     <w:p>
@@ -2898,6 +2898,62 @@
               <w:rPr>
                 <w:sz w:val="18"/>
               </w:rPr>
+              <w:t>测试连接提示短测试达到输出上限</w:t>
+            </w:r>
+          </w:p>
+        </w:tc>
+        <w:tc>
+          <w:tcPr>
+            <w:tcW w:type="dxa" w:w="5040"/>
+          </w:tcPr>
+          <w:p>
+            <w:r>
+              <w:rPr>
+                <w:sz w:val="18"/>
+              </w:rPr>
+              <w:t>测试请求不发送课程材料，使用较小的输出额度。推理模型可能先用完额度再输出正文；连接成功不代表完整生成已验证，可先用少量材料试生成。旧版若显示“模型输出被长度限制截断”，请更新工作台后重新测试。</w:t>
+            </w:r>
+          </w:p>
+        </w:tc>
+      </w:tr>
+      <w:tr>
+        <w:tc>
+          <w:tcPr>
+            <w:tcW w:type="dxa" w:w="5040"/>
+          </w:tcPr>
+          <w:p>
+            <w:r>
+              <w:rPr>
+                <w:sz w:val="18"/>
+              </w:rPr>
+              <w:t>生成学习内容时提示模型输出被长度限制截断</w:t>
+            </w:r>
+          </w:p>
+        </w:tc>
+        <w:tc>
+          <w:tcPr>
+            <w:tcW w:type="dxa" w:w="5040"/>
+          </w:tcPr>
+          <w:p>
+            <w:r>
+              <w:rPr>
+                <w:sz w:val="18"/>
+              </w:rPr>
+              <w:t>本次生成未完成、不会保存。减少题目数量或缩小材料范围再试；推理模型也可能将输出额度用于推理，可按服务商说明选择适合当前任务的模式或模型。</w:t>
+            </w:r>
+          </w:p>
+        </w:tc>
+      </w:tr>
+      <w:tr>
+        <w:tc>
+          <w:tcPr>
+            <w:tcW w:type="dxa" w:w="5040"/>
+          </w:tcPr>
+          <w:p>
+            <w:r>
+              <w:rPr>
+                <w:sz w:val="18"/>
+              </w:rPr>
               <w:t>模型输出格式不符合要求 / 引用了未提供位置</w:t>
             </w:r>
           </w:p>

</xml_diff>

<commit_message>
fix: handle truncated study generation and DeepSeek thinking budgets
</commit_message>
<xml_diff>
--- a/docs/使用说明书.docx
+++ b/docs/使用说明书.docx
@@ -1087,6 +1087,19 @@
     <w:p>
       <w:r>
         <w:t>右上角“API 已配置”表示本次运行已有密钥，不等于所有模型请求都一定成功。测试连接只验证一次基本请求，后续生成还可能受额度、网络、模型输出格式或材料长度影响。模型应支持 OpenAI 兼容 Chat Completions 与中文 JSON 输出。</w:t>
+      </w:r>
+    </w:p>
+    <w:p>
+      <w:r>
+        <w:t>展开“生成设置（出现截断时查看）”，可以调整首次输出额度，默认 8192 token。DeepSeek 官方接口默认选“快速生成”，请求关闭深度思考；可自行改为深度思考或沿用模型默认模式。其他服务不受这个选项影响。如果模型不接受思考参数，请选“沿用模型默认模式”。部分模型的思考过程也占用输出额度。</w:t>
+      </w:r>
+    </w:p>
+    <w:p>
+      <w:r>
+        <w:rPr>
+          <w:color w:val="8B6E48"/>
+        </w:rPr>
+        <w:t>请留意：实际生成被截断时，工作台会提高额度重新生成一次，最高翻倍且不超过 65536 token，可能增加费用。请确认重试额度也在模型支持范围内；例如模型最多允许 8192，就将首次额度设置为 4096 或更低。连续截断的结果不会保存。每次请求可能需要较长时间，请等待当前操作完成再重试。</w:t>
       </w:r>
     </w:p>
     <w:p>
@@ -2926,7 +2939,7 @@
               <w:rPr>
                 <w:sz w:val="18"/>
               </w:rPr>
-              <w:t>生成学习内容时提示模型输出被长度限制截断</w:t>
+              <w:t>生成学习内容时提示模型输出仍被截断</w:t>
             </w:r>
           </w:p>
         </w:tc>
@@ -2939,7 +2952,35 @@
               <w:rPr>
                 <w:sz w:val="18"/>
               </w:rPr>
-              <w:t>本次生成未完成、不会保存。减少题目数量或缩小材料范围再试；推理模型也可能将输出额度用于推理，可按服务商说明选择适合当前任务的模式或模型。</w:t>
+              <w:t>本次生成未完成、不会保存。到 API 设置展开“生成设置”，DeepSeek 优先选择“快速生成”；按模型允许范围调整首次输出额度。工作台最多提高额度自动重试一次。仍失败时减少题目数量或缩小材料范围。</w:t>
+            </w:r>
+          </w:p>
+        </w:tc>
+      </w:tr>
+      <w:tr>
+        <w:tc>
+          <w:tcPr>
+            <w:tcW w:type="dxa" w:w="5040"/>
+          </w:tcPr>
+          <w:p>
+            <w:r>
+              <w:rPr>
+                <w:sz w:val="18"/>
+              </w:rPr>
+              <w:t>API 不接受当前请求参数</w:t>
+            </w:r>
+          </w:p>
+        </w:tc>
+        <w:tc>
+          <w:tcPr>
+            <w:tcW w:type="dxa" w:w="5040"/>
+          </w:tcPr>
+          <w:p>
+            <w:r>
+              <w:rPr>
+                <w:sz w:val="18"/>
+              </w:rPr>
+              <w:t>首次输出额度及自动重试额度可能超出模型限制，请按服务商说明调低。若 DeepSeek 旧模型不接受思考参数，可将生成方式改为“沿用模型默认模式”，保存后再试。</w:t>
             </w:r>
           </w:p>
         </w:tc>

</xml_diff>

<commit_message>
fix: simplify source citations and retry invalid references safely
</commit_message>
<xml_diff>
--- a/docs/使用说明书.docx
+++ b/docs/使用说明书.docx
@@ -1099,7 +1099,7 @@
         <w:rPr>
           <w:color w:val="8B6E48"/>
         </w:rPr>
-        <w:t>请留意：实际生成被截断时，工作台会提高额度重新生成一次，最高翻倍且不超过 65536 token，可能增加费用。请确认重试额度也在模型支持范围内；例如模型最多允许 8192，就将首次额度设置为 4096 或更低。连续截断的结果不会保存。每次请求可能需要较长时间，请等待当前操作完成再重试。</w:t>
+        <w:t>请留意：输出被截断或引用位置不合法时，工作台合计最多自动重试一次，可能增加费用。截断重试会提高额度，最高翻倍且不超过 65536 token。请确认重试额度也在模型支持范围内；例如模型最多允许 8192，就将首次额度设置为 4096 或更低。连续截断或引用仍不合法的结果不会保存。每次请求可能需要较长时间，请等待当前操作完成再重试。</w:t>
       </w:r>
     </w:p>
     <w:p>
@@ -2995,7 +2995,7 @@
               <w:rPr>
                 <w:sz w:val="18"/>
               </w:rPr>
-              <w:t>模型输出格式不符合要求 / 引用了未提供位置</w:t>
+              <w:t>模型输出格式不符合要求</w:t>
             </w:r>
           </w:p>
         </w:tc>
@@ -3009,6 +3009,34 @@
                 <w:sz w:val="18"/>
               </w:rPr>
               <w:t>本次结果未保存。缩小材料范围再试，或换成服务商明确支持中文 JSON 输出的兼容模型。</w:t>
+            </w:r>
+          </w:p>
+        </w:tc>
+      </w:tr>
+      <w:tr>
+        <w:tc>
+          <w:tcPr>
+            <w:tcW w:type="dxa" w:w="5040"/>
+          </w:tcPr>
+          <w:p>
+            <w:r>
+              <w:rPr>
+                <w:sz w:val="18"/>
+              </w:rPr>
+              <w:t>模型引用的来源仍不在本次提供的材料片段中</w:t>
+            </w:r>
+          </w:p>
+        </w:tc>
+        <w:tc>
+          <w:tcPr>
+            <w:tcW w:type="dxa" w:w="5040"/>
+          </w:tcPr>
+          <w:p>
+            <w:r>
+              <w:rPr>
+                <w:sz w:val="18"/>
+              </w:rPr>
+              <w:t>程序会尝试让模型重新生成；与截断重试合计最多一次，仍不合法的结果不会保存。先更新到最新版并重启，再指定一个较小的学习主题，或更换模型。已有材料无需重新上传。来源位置存在也不代表医学结论一定正确，仍需点开原文核对。</w:t>
             </w:r>
           </w:p>
         </w:tc>

</xml_diff>